<commit_message>
added documentation for biology minigame
</commit_message>
<xml_diff>
--- a/Documenten/Game Design Document.docx
+++ b/Documenten/Game Design Document.docx
@@ -2072,14 +2072,16 @@
           <w:rFonts w:ascii="Arial" w:hAnsi="Arial" w:cs="Arial"/>
           <w:sz w:val="28"/>
           <w:szCs w:val="28"/>
-        </w:rPr>
-      </w:pPr>
-      <w:proofErr w:type="gramStart"/>
-      <w:r>
-        <w:rPr>
-          <w:rFonts w:ascii="Arial" w:hAnsi="Arial" w:cs="Arial"/>
-          <w:sz w:val="28"/>
-          <w:szCs w:val="28"/>
+          <w:lang w:val="nl-NL"/>
+        </w:rPr>
+      </w:pPr>
+      <w:proofErr w:type="gramStart"/>
+      <w:r>
+        <w:rPr>
+          <w:rFonts w:ascii="Arial" w:hAnsi="Arial" w:cs="Arial"/>
+          <w:sz w:val="28"/>
+          <w:szCs w:val="28"/>
+          <w:lang w:val="nl-NL"/>
         </w:rPr>
         <w:t>D :</w:t>
       </w:r>
@@ -2089,6 +2091,7 @@
           <w:rFonts w:ascii="Arial" w:hAnsi="Arial" w:cs="Arial"/>
           <w:sz w:val="28"/>
           <w:szCs w:val="28"/>
+          <w:lang w:val="nl-NL"/>
         </w:rPr>
         <w:t xml:space="preserve"> Horus</w:t>
       </w:r>
@@ -2097,10 +2100,151 @@
       <w:pPr>
         <w:rPr>
           <w:rFonts w:ascii="Arial" w:hAnsi="Arial" w:cs="Arial"/>
-          <w:sz w:val="28"/>
-          <w:szCs w:val="28"/>
-        </w:rPr>
-      </w:pPr>
+          <w:b/>
+          <w:bCs/>
+          <w:sz w:val="44"/>
+          <w:szCs w:val="44"/>
+          <w:lang w:val="nl-NL"/>
+        </w:rPr>
+      </w:pPr>
+      <w:r>
+        <w:rPr>
+          <w:rFonts w:ascii="Arial" w:hAnsi="Arial" w:cs="Arial"/>
+          <w:sz w:val="28"/>
+          <w:szCs w:val="28"/>
+          <w:lang w:val="nl-NL"/>
+        </w:rPr>
+        <w:br/>
+      </w:r>
+      <w:r>
+        <w:rPr>
+          <w:rFonts w:ascii="Arial" w:hAnsi="Arial" w:cs="Arial"/>
+          <w:sz w:val="28"/>
+          <w:szCs w:val="28"/>
+          <w:lang w:val="nl-NL"/>
+        </w:rPr>
+        <w:br/>
+      </w:r>
+      <w:r>
+        <w:rPr>
+          <w:rFonts w:ascii="Arial" w:hAnsi="Arial" w:cs="Arial"/>
+          <w:sz w:val="28"/>
+          <w:szCs w:val="28"/>
+          <w:lang w:val="nl-NL"/>
+        </w:rPr>
+        <w:lastRenderedPageBreak/>
+        <w:br/>
+      </w:r>
+      <w:r>
+        <w:rPr>
+          <w:rFonts w:ascii="Arial" w:hAnsi="Arial" w:cs="Arial"/>
+          <w:b/>
+          <w:bCs/>
+          <w:sz w:val="44"/>
+          <w:szCs w:val="44"/>
+          <w:lang w:val="nl-NL"/>
+        </w:rPr>
+        <w:t xml:space="preserve">Minigame </w:t>
+      </w:r>
+      <w:r>
+        <w:rPr>
+          <w:rFonts w:ascii="Arial" w:hAnsi="Arial" w:cs="Arial"/>
+          <w:b/>
+          <w:bCs/>
+          <w:sz w:val="44"/>
+          <w:szCs w:val="44"/>
+          <w:lang w:val="nl-NL"/>
+        </w:rPr>
+        <w:t>Biologie</w:t>
+      </w:r>
+    </w:p>
+    <w:p>
+      <w:pPr>
+        <w:rPr>
+          <w:rFonts w:ascii="Arial" w:hAnsi="Arial" w:cs="Arial"/>
+          <w:sz w:val="28"/>
+          <w:szCs w:val="28"/>
+          <w:lang w:val="nl-NL"/>
+        </w:rPr>
+      </w:pPr>
+      <w:r>
+        <w:rPr>
+          <w:rFonts w:ascii="Arial" w:hAnsi="Arial" w:cs="Arial"/>
+          <w:sz w:val="28"/>
+          <w:szCs w:val="28"/>
+          <w:lang w:val="nl-NL"/>
+        </w:rPr>
+        <w:t>Ik heb h</w:t>
+      </w:r>
+      <w:r>
+        <w:rPr>
+          <w:rFonts w:ascii="Arial" w:hAnsi="Arial" w:cs="Arial"/>
+          <w:sz w:val="28"/>
+          <w:szCs w:val="28"/>
+          <w:lang w:val="nl-NL"/>
+        </w:rPr>
+        <w:t xml:space="preserve">et idee dat je moet mixen en matchen tussen 2 dingen zodat je een goeie </w:t>
+      </w:r>
+      <w:proofErr w:type="spellStart"/>
+      <w:r>
+        <w:rPr>
+          <w:rFonts w:ascii="Arial" w:hAnsi="Arial" w:cs="Arial"/>
+          <w:sz w:val="28"/>
+          <w:szCs w:val="28"/>
+          <w:lang w:val="nl-NL"/>
+        </w:rPr>
+        <w:t>spell</w:t>
+      </w:r>
+      <w:proofErr w:type="spellEnd"/>
+      <w:r>
+        <w:rPr>
+          <w:rFonts w:ascii="Arial" w:hAnsi="Arial" w:cs="Arial"/>
+          <w:sz w:val="28"/>
+          <w:szCs w:val="28"/>
+          <w:lang w:val="nl-NL"/>
+        </w:rPr>
+        <w:t xml:space="preserve"> ofzo iets krijgt. Misschien dat je iets moet maken en dan pak je objecten op en zo. Een beetje zoals Overcooked misschien. Dan heb je een boek met alle recepten erop zodat je niet compleet in het donker zit qua hoe je het moet doen. Ik ga wel </w:t>
+      </w:r>
+      <w:proofErr w:type="spellStart"/>
+      <w:r>
+        <w:rPr>
+          <w:rFonts w:ascii="Arial" w:hAnsi="Arial" w:cs="Arial"/>
+          <w:sz w:val="28"/>
+          <w:szCs w:val="28"/>
+          <w:lang w:val="nl-NL"/>
+        </w:rPr>
+        <w:t>wss</w:t>
+      </w:r>
+      <w:proofErr w:type="spellEnd"/>
+      <w:r>
+        <w:rPr>
+          <w:rFonts w:ascii="Arial" w:hAnsi="Arial" w:cs="Arial"/>
+          <w:sz w:val="28"/>
+          <w:szCs w:val="28"/>
+          <w:lang w:val="nl-NL"/>
+        </w:rPr>
+        <w:t xml:space="preserve"> </w:t>
+      </w:r>
+      <w:proofErr w:type="spellStart"/>
+      <w:r>
+        <w:rPr>
+          <w:rFonts w:ascii="Arial" w:hAnsi="Arial" w:cs="Arial"/>
+          <w:sz w:val="28"/>
+          <w:szCs w:val="28"/>
+          <w:lang w:val="nl-NL"/>
+        </w:rPr>
+        <w:t>sprites</w:t>
+      </w:r>
+      <w:proofErr w:type="spellEnd"/>
+      <w:r>
+        <w:rPr>
+          <w:rFonts w:ascii="Arial" w:hAnsi="Arial" w:cs="Arial"/>
+          <w:sz w:val="28"/>
+          <w:szCs w:val="28"/>
+          <w:lang w:val="nl-NL"/>
+        </w:rPr>
+        <w:t xml:space="preserve"> of zelf moeten maken of op het internet zoeken</w:t>
+      </w:r>
     </w:p>
     <w:sectPr>
       <w:pgSz w:w="12240" w:h="15840"/>

</xml_diff>

<commit_message>
game design document got changed by the merge so i updated an image
</commit_message>
<xml_diff>
--- a/Documenten/Game Design Document.docx
+++ b/Documenten/Game Design Document.docx
@@ -2164,7 +2164,6 @@
           <w:rFonts w:ascii="Arial" w:hAnsi="Arial" w:cs="Arial"/>
           <w:sz w:val="28"/>
           <w:szCs w:val="28"/>
-          <w:lang w:val="nl-NL"/>
         </w:rPr>
       </w:pPr>
       <w:r>
@@ -2244,6 +2243,59 @@
           <w:lang w:val="nl-NL"/>
         </w:rPr>
         <w:t xml:space="preserve"> of zelf moeten maken of op het internet zoeken</w:t>
+      </w:r>
+      <w:r>
+        <w:rPr>
+          <w:noProof/>
+        </w:rPr>
+        <w:drawing>
+          <wp:inline distT="0" distB="0" distL="0" distR="0" wp14:anchorId="152A9807" wp14:editId="4D16DB58">
+            <wp:extent cx="5972810" cy="4214495"/>
+            <wp:effectExtent l="0" t="0" r="8890" b="0"/>
+            <wp:docPr id="668906365" name="Afbeelding 1"/>
+            <wp:cNvGraphicFramePr>
+              <a:graphicFrameLocks xmlns:a="http://schemas.openxmlformats.org/drawingml/2006/main" noChangeAspect="1"/>
+            </wp:cNvGraphicFramePr>
+            <a:graphic xmlns:a="http://schemas.openxmlformats.org/drawingml/2006/main">
+              <a:graphicData uri="http://schemas.openxmlformats.org/drawingml/2006/picture">
+                <pic:pic xmlns:pic="http://schemas.openxmlformats.org/drawingml/2006/picture">
+                  <pic:nvPicPr>
+                    <pic:cNvPr id="0" name="Picture 1"/>
+                    <pic:cNvPicPr>
+                      <a:picLocks noChangeAspect="1" noChangeArrowheads="1"/>
+                    </pic:cNvPicPr>
+                  </pic:nvPicPr>
+                  <pic:blipFill>
+                    <a:blip r:embed="rId4">
+                      <a:extLst>
+                        <a:ext uri="{28A0092B-C50C-407E-A947-70E740481C1C}">
+                          <a14:useLocalDpi xmlns:a14="http://schemas.microsoft.com/office/drawing/2010/main" val="0"/>
+                        </a:ext>
+                      </a:extLst>
+                    </a:blip>
+                    <a:srcRect/>
+                    <a:stretch>
+                      <a:fillRect/>
+                    </a:stretch>
+                  </pic:blipFill>
+                  <pic:spPr bwMode="auto">
+                    <a:xfrm>
+                      <a:off x="0" y="0"/>
+                      <a:ext cx="5972810" cy="4214495"/>
+                    </a:xfrm>
+                    <a:prstGeom prst="rect">
+                      <a:avLst/>
+                    </a:prstGeom>
+                    <a:noFill/>
+                    <a:ln>
+                      <a:noFill/>
+                    </a:ln>
+                  </pic:spPr>
+                </pic:pic>
+              </a:graphicData>
+            </a:graphic>
+          </wp:inline>
+        </w:drawing>
       </w:r>
     </w:p>
     <w:sectPr>

</xml_diff>